<commit_message>
feat: enforce product sterilization, ratings, and expand SOW doc compliance
</commit_message>
<xml_diff>
--- a/project_docs/architecture.docx
+++ b/project_docs/architecture.docx
@@ -288,55 +288,47 @@
         <w:spacing w:after="150"/>
       </w:pPr>
       <w:r>
-        <w:t xml:space="preserve">│  TikTok Creative Center (RapidAPI)  →  Orchestrator           │</w:t>
-      </w:r>
-    </w:p>
-    <w:p>
-      <w:pPr>
-        <w:spacing w:after="150"/>
-      </w:pPr>
-      <w:r>
-        <w:t xml:space="preserve">│    ├─ Top ads (/api/trending/ads)                            │</w:t>
-      </w:r>
-    </w:p>
-    <w:p>
-      <w:pPr>
-        <w:spacing w:after="150"/>
-      </w:pPr>
-      <w:r>
-        <w:t xml:space="preserve">│    ├─ Trending videos (/api/trending/video)                  │</w:t>
-      </w:r>
-    </w:p>
-    <w:p>
-      <w:pPr>
-        <w:spacing w:after="150"/>
-      </w:pPr>
-      <w:r>
-        <w:t xml:space="preserve">│    ├─ Trending hashtags (/api/trending/hashtag)              │</w:t>
-      </w:r>
-    </w:p>
-    <w:p>
-      <w:pPr>
-        <w:spacing w:after="150"/>
-      </w:pPr>
-      <w:r>
-        <w:t xml:space="preserve">│    └─ Keyword trends (/api/trending/keyword)                 │</w:t>
-      </w:r>
-    </w:p>
-    <w:p>
-      <w:pPr>
-        <w:spacing w:after="150"/>
-      </w:pPr>
-      <w:r>
-        <w:t xml:space="preserve">│                                                                │</w:t>
-      </w:r>
-    </w:p>
-    <w:p>
-      <w:pPr>
-        <w:spacing w:after="150"/>
-      </w:pPr>
-      <w:r>
-        <w:t xml:space="preserve">│  Product Extraction (Multi-Provider AI with Fallback):       │</w:t>
+        <w:t xml:space="preserve">│  EnsembleData API (Primary)  →  Orchestrator                      │</w:t>
+      </w:r>
+    </w:p>
+    <w:p>
+      <w:pPr>
+        <w:spacing w:after="150"/>
+      </w:pPr>
+      <w:r>
+        <w:t xml:space="preserve">│    ├─ Keyword-based discovery                                     │</w:t>
+      </w:r>
+    </w:p>
+    <w:p>
+      <w:pPr>
+        <w:spacing w:after="150"/>
+      </w:pPr>
+      <w:r>
+        <w:t xml:space="preserve">│    ├─ Hashtag-based deep collection                              │</w:t>
+      </w:r>
+    </w:p>
+    <w:p>
+      <w:pPr>
+        <w:spacing w:after="150"/>
+      </w:pPr>
+      <w:r>
+        <w:t xml:space="preserve">│    └─ Comment-based intent analysis                              │</w:t>
+      </w:r>
+    </w:p>
+    <w:p>
+      <w:pPr>
+        <w:spacing w:after="150"/>
+      </w:pPr>
+      <w:r>
+        <w:t xml:space="preserve">│                                                                  │</w:t>
+      </w:r>
+    </w:p>
+    <w:p>
+      <w:pPr>
+        <w:spacing w:after="150"/>
+      </w:pPr>
+      <w:r>
+        <w:t xml:space="preserve">│  Product Extraction (Multi-Provider AI with Fallback):           │</w:t>
       </w:r>
     </w:p>
     <w:p>
@@ -347,14 +339,7 @@
         <w:t xml:space="preserve">│    1. DeepSeek API (primary, lowest cost)                    │</w:t>
       </w:r>
     </w:p>
-    <w:p>
-      <w:pPr>
-        <w:spacing w:after="150"/>
-      </w:pPr>
-      <w:r>
-        <w:t xml:space="preserve">│    2. Anthropic Claude (fallback)                            │</w:t>
-      </w:r>
-    </w:p>
+    <w:p/>
     <w:p>
       <w:pPr>
         <w:spacing w:after="150"/>
@@ -613,31 +598,23 @@
         <w:spacing w:after="100"/>
       </w:pPr>
       <w:r>
-        <w:t xml:space="preserve">**TikTok Creative Center (RapidAPI)**: Primary data source collecting trending ads, videos, hashtags, and keyword trends</w:t>
-      </w:r>
-    </w:p>
-    <w:p>
-      <w:pPr>
-        <w:spacing w:after="150"/>
-      </w:pPr>
-      <w:r>
-        <w:t xml:space="preserve">  - Endpoint: `https://tiktok-creative-center-api.p.rapidapi.com/api/trending/{ads|video|hashtag|keyword}`</w:t>
-      </w:r>
-    </w:p>
-    <w:p>
-      <w:pPr>
-        <w:spacing w:after="150"/>
-      </w:pPr>
-      <w:r>
-        <w:t xml:space="preserve">  - Handles nested response structures with flexible fallback parsing (`data?.data?.materials ?? data?.data?.videos ?? data?.data?.list`)</w:t>
-      </w:r>
-    </w:p>
-    <w:p>
-      <w:pPr>
-        <w:spacing w:after="150"/>
-      </w:pPr>
-      <w:r>
-        <w:t xml:space="preserve">  - Requires: `RAPIDAPI_KEY` environment variable</w:t>
+        <w:t xml:space="preserve">**EnsembleData API**: Primary data source collecting trending products, videos, hashtags, and keyword trends via the EnsembleData TikTok API.</w:t>
+      </w:r>
+    </w:p>
+    <w:p>
+      <w:pPr>
+        <w:spacing w:after="150"/>
+      </w:pPr>
+      <w:r>
+        <w:t xml:space="preserve">  - Requires: `ENSEMBLE_API_KEY` environment variable.</w:t>
+      </w:r>
+    </w:p>
+    <w:p>
+      <w:pPr>
+        <w:spacing w:after="150"/>
+      </w:pPr>
+      <w:r>
+        <w:t xml:space="preserve">  - Configuration: `TIKTOK_REGION` (default: `US`).</w:t>
       </w:r>
     </w:p>
     <w:p/>
@@ -691,38 +668,7 @@
       </w:r>
     </w:p>
     <w:p/>
-    <w:p>
-      <w:pPr>
-        <w:spacing w:after="150"/>
-      </w:pPr>
-      <w:r>
-        <w:t xml:space="preserve">2. **Anthropic Claude** (fallback, higher cost ~$3/1M input tokens)</w:t>
-      </w:r>
-    </w:p>
-    <w:p>
-      <w:pPr>
-        <w:spacing w:after="150"/>
-      </w:pPr>
-      <w:r>
-        <w:t xml:space="preserve">   - Environment variable: `ANTHROPIC_API_KEY`</w:t>
-      </w:r>
-    </w:p>
-    <w:p>
-      <w:pPr>
-        <w:spacing w:after="150"/>
-      </w:pPr>
-      <w:r>
-        <w:t xml:space="preserve">   - Model: `claude-3-5-sonnet-20241022`</w:t>
-      </w:r>
-    </w:p>
-    <w:p>
-      <w:pPr>
-        <w:spacing w:after="150"/>
-      </w:pPr>
-      <w:r>
-        <w:t xml:space="preserve">   - Format: Anthropic-specific message format</w:t>
-      </w:r>
-    </w:p>
+    <w:p/>
     <w:p/>
     <w:p>
       <w:pPr>
@@ -805,38 +751,7 @@
         <w:t xml:space="preserve">        │       └─ Failure → try next provider</w:t>
       </w:r>
     </w:p>
-    <w:p>
-      <w:pPr>
-        <w:spacing w:after="150"/>
-      </w:pPr>
-      <w:r>
-        <w:t xml:space="preserve">        └─ No  → Check if ANTHROPIC_API_KEY exists</w:t>
-      </w:r>
-    </w:p>
-    <w:p>
-      <w:pPr>
-        <w:spacing w:after="150"/>
-      </w:pPr>
-      <w:r>
-        <w:t xml:space="preserve">                ├─ Yes → Call Anthropic</w:t>
-      </w:r>
-    </w:p>
-    <w:p>
-      <w:pPr>
-        <w:spacing w:after="150"/>
-      </w:pPr>
-      <w:r>
-        <w:t xml:space="preserve">                │       └─ Success → return extraction</w:t>
-      </w:r>
-    </w:p>
-    <w:p>
-      <w:pPr>
-        <w:spacing w:after="150"/>
-      </w:pPr>
-      <w:r>
-        <w:t xml:space="preserve">                │       └─ Failure → try next provider</w:t>
-      </w:r>
-    </w:p>
+    <w:p/>
     <w:p>
       <w:pPr>
         <w:spacing w:after="150"/>

</xml_diff>

<commit_message>
feat: add jobs management api and revert rapidapi changes
</commit_message>
<xml_diff>
--- a/project_docs/architecture.docx
+++ b/project_docs/architecture.docx
@@ -328,6 +328,38 @@
         <w:spacing w:after="150"/>
       </w:pPr>
       <w:r>
+        <w:t xml:space="preserve">│  Verified Grounding (Hard metric extraction):                    │</w:t>
+      </w:r>
+    </w:p>
+    <w:p>
+      <w:pPr>
+        <w:spacing w:after="150"/>
+      </w:pPr>
+      <w:r>
+        <w:t xml:space="preserve">│    ├─ Amazon "recent_sales" (Rainforest API)                     │</w:t>
+      </w:r>
+    </w:p>
+    <w:p>
+      <w:pPr>
+        <w:spacing w:after="150"/>
+      </w:pPr>
+      <w:r>
+        <w:t xml:space="preserve">│    └─ Web Search Fallback (AliExpress/Walmart grounding)         │</w:t>
+      </w:r>
+    </w:p>
+    <w:p>
+      <w:pPr>
+        <w:spacing w:after="150"/>
+      </w:pPr>
+      <w:r>
+        <w:t xml:space="preserve">│                                                                  │</w:t>
+      </w:r>
+    </w:p>
+    <w:p>
+      <w:pPr>
+        <w:spacing w:after="150"/>
+      </w:pPr>
+      <w:r>
         <w:t xml:space="preserve">│  Product Extraction (Multi-Provider AI with Fallback):           │</w:t>
       </w:r>
     </w:p>
@@ -504,7 +536,7 @@
         <w:spacing w:after="150"/>
       </w:pPr>
       <w:r>
-        <w:t xml:space="preserve">All business logic lives here. Services apply rules and cross-cutting logic (authentication, token issuance, email flows) before returning data to controllers.</w:t>
+        <w:t xml:space="preserve">All business logic lives here. Services apply rules and cross-cutting logic (authentication, token issuance, regional preferences, email flows) before returning data to controllers.</w:t>
       </w:r>
     </w:p>
     <w:p/>
@@ -615,6 +647,51 @@
       </w:pPr>
       <w:r>
         <w:t xml:space="preserve">  - Configuration: `TIKTOK_REGION` (default: `US`).</w:t>
+      </w:r>
+    </w:p>
+    <w:p>
+      <w:pPr>
+        <w:pStyle w:val="ListParagraph"/>
+        <w:numPr>
+          <w:ilvl w:val="0"/>
+          <w:numId w:val="1"/>
+        </w:numPr>
+        <w:spacing w:after="100"/>
+      </w:pPr>
+      <w:r>
+        <w:t xml:space="preserve">**Verified Unit Sales Grounding**:</w:t>
+      </w:r>
+    </w:p>
+    <w:p>
+      <w:pPr>
+        <w:spacing w:after="150"/>
+      </w:pPr>
+      <w:r>
+        <w:t xml:space="preserve">  - The system rejects all AI-estimated unit counts.</w:t>
+      </w:r>
+    </w:p>
+    <w:p>
+      <w:pPr>
+        <w:spacing w:after="150"/>
+      </w:pPr>
+      <w:r>
+        <w:t xml:space="preserve">  - It parses hard platform-reported counts from Amazon listings.</w:t>
+      </w:r>
+    </w:p>
+    <w:p>
+      <w:pPr>
+        <w:spacing w:after="150"/>
+      </w:pPr>
+      <w:r>
+        <w:t xml:space="preserve">  - It uses targeted Google Search (`site:aliexpress.com OR site:walmart.com`) if Amazon data is unavailable.</w:t>
+      </w:r>
+    </w:p>
+    <w:p>
+      <w:pPr>
+        <w:spacing w:after="150"/>
+      </w:pPr>
+      <w:r>
+        <w:t xml:space="preserve">  - High-confidence sales links are flagged as `verified: true` in the feed.</w:t>
       </w:r>
     </w:p>
     <w:p/>

</xml_diff>